<commit_message>
docs(standards): update the rules the phase 1 review changed
NET-3 now lists every naming rule .editorconfig enforces. UI-6 and
OBS-5 keep a crashed Checkout closed until the clerk presses an F-key,
and OBS-5 adds the ErrorBoundary around the whole shell and shuts
Rewind down when the shell crashes before it has started. UI-11 sends a
background handler's exception to DispatchExceptionAsync. Tooling shows
BannedSymbols.txt in Directory.Build.props and says what it bans. The
date moves to Oct 23, 2026.

Co-Authored-By: Claude Opus 5.5 <noreply@anthropic.com>
</commit_message>
<xml_diff>
--- a/docs/Rewind - Coding Standards.docx
+++ b/docs/Rewind - Coding Standards.docx
@@ -13,7 +13,7 @@
     <w:p>
       <w:pPr/>
       <w:r>
-        <w:t xml:space="preserve">Oct 20, 2026</w:t>
+        <w:t xml:space="preserve">Oct 23, 2026</w:t>
       </w:r>
       <w:r>
         <w:t xml:space="preserve"> · </w:t>
@@ -501,7 +501,7 @@
         <w:t xml:space="preserve">NET-3</w:t>
       </w:r>
       <w:r>
-        <w:t xml:space="preserve"> Naming: PascalCase for types, methods, properties and constants; camelCase for locals and parameters; _camelCase for private fields; an I prefix for interfaces; an Async suffix for async methods.</w:t>
+        <w:t xml:space="preserve"> Naming: PascalCase for types, methods, properties, events, static readonly fields and constants (local ones too); camelCase for other locals and parameters; _camelCase for other private fields; an I prefix for interfaces; an Async suffix for async methods except tests, which follow TEST-6.</w:t>
       </w:r>
     </w:p>
     <w:p>
@@ -1009,7 +1009,7 @@
         <w:t xml:space="preserve">UI-6</w:t>
       </w:r>
       <w:r>
-        <w:t xml:space="preserve"> Every view handles loading, empty and error states. Each screen sits in an ErrorBoundary that shows a Windows 98 error dialog and returns to Checkout.</w:t>
+        <w:t xml:space="preserve"> Every view handles loading, empty and error states. Each screen sits in an ErrorBoundary that shows a Windows 98 error dialog and returns to Checkout, unless Checkout is what crashed.</w:t>
       </w:r>
     </w:p>
     <w:p>
@@ -1099,7 +1099,7 @@
         <w:t xml:space="preserve">UI-11</w:t>
       </w:r>
       <w:r>
-        <w:t xml:space="preserve"> Background events, such as scans and drops, reach components only through InvokeAsync, never straight from a serial thread.</w:t>
+        <w:t xml:space="preserve"> Background events, such as scans and drops, reach components only through InvokeAsync, never straight from a serial thread, and a handler's exception goes to DispatchExceptionAsync so the screen's ErrorBoundary catches it.</w:t>
       </w:r>
     </w:p>
     <w:p>
@@ -2033,7 +2033,7 @@
         <w:t xml:space="preserve">OBS-5</w:t>
       </w:r>
       <w:r>
-        <w:t xml:space="preserve"> Unhandled exceptions are caught in three places. Each screen's ErrorBoundary and Application.ThreadException log, show the Windows 98 error dialog and return to Checkout. AppDomain.UnhandledException can only log: the process then ends, and the launcher restarts Rewind.</w:t>
+        <w:t xml:space="preserve"> Unhandled exceptions are caught in four places. Each screen's ErrorBoundary, the ErrorBoundary around the whole shell and Application.ThreadException log, show the Windows 98 error dialog and return to Checkout, unless Checkout is what crashed: it then stays closed until the clerk presses an F-key. AppDomain.UnhandledException can only log: the process then ends, and the launcher restarts Rewind. Recovery never reopens what just crashed on its own, so a shell that crashes before it has started shuts Rewind down.</w:t>
       </w:r>
     </w:p>
     <w:p>
@@ -2239,6 +2239,12 @@
         <w:br/>
         <w:t xml:space="preserve">  &lt;/PropertyGroup&gt;</w:t>
         <w:br/>
+        <w:t xml:space="preserve">  &lt;ItemGroup&gt;</w:t>
+        <w:br/>
+        <w:t xml:space="preserve">    &lt;AdditionalFiles Include="$(MSBuildThisFileDirectory)BannedSymbols.txt" /&gt;</w:t>
+        <w:br/>
+        <w:t xml:space="preserve">  &lt;/ItemGroup&gt;</w:t>
+        <w:br/>
         <w:t xml:space="preserve">&lt;/Project&gt;</w:t>
       </w:r>
     </w:p>
@@ -2294,6 +2300,18 @@
       </w:pPr>
       <w:r>
         <w:t xml:space="preserve">.editorconfig holds the C# naming and style rules, and CI runs dotnet format --verify-no-changes.</w:t>
+      </w:r>
+    </w:p>
+    <w:p>
+      <w:pPr>
+        <w:pStyle w:val="ListParagraph"/>
+        <w:numPr>
+          <w:ilvl w:val="0"/>
+          <w:numId w:val="14"/>
+        </w:numPr>
+      </w:pPr>
+      <w:r>
+        <w:t xml:space="preserve">BannedSymbols.txt lists the APIs that NET-6 and NET-8 forbid, such as DateTime.Now and Task.Result, and the BannedApiAnalyzers package fails the build wherever one is used.</w:t>
       </w:r>
     </w:p>
     <w:p>

</xml_diff>

<commit_message>
ci: fail a PR whose title isn't a Conventional Commit
Squash-merging makes a pull request's title main's commit message
(GIT-5), and GitHub titles a pull request of several commits after its
branch. That's how "Feat/barcode scanner (#5)" reached main. A new
workflow, pr-title.yml, checks the title against GIT-3's types whenever
a pull request is opened, edited or pushed to. The PR template asks for
such a title, and the Coding Standards list the check with CI's others.

Co-Authored-By: Claude Opus 5.5 <noreply@anthropic.com>
</commit_message>
<xml_diff>
--- a/docs/Rewind - Coding Standards.docx
+++ b/docs/Rewind - Coding Standards.docx
@@ -2408,6 +2408,18 @@
       </w:pPr>
       <w:r>
         <w:t xml:space="preserve">NuGet audit: restore fails on a high or critical advisory.</w:t>
+      </w:r>
+    </w:p>
+    <w:p>
+      <w:pPr>
+        <w:pStyle w:val="ListParagraph"/>
+        <w:numPr>
+          <w:ilvl w:val="0"/>
+          <w:numId w:val="15"/>
+        </w:numPr>
+      </w:pPr>
+      <w:r>
+        <w:t xml:space="preserve">Pull request title: a Conventional Commit, since squash-merging makes it main's commit message (GIT-3, GIT-5).</w:t>
       </w:r>
     </w:p>
     <w:p>

</xml_diff>

<commit_message>
feat(data): model the catalog
Movies, MovieCast, Genres, MovieGenres, Cases, CaseMovies and
UpcLookups, added by one migration, AddCatalog (Build Plan 2.1). The
database holds the rules it can (DATA-11): unique labels, TMDB IDs,
billing places and UPC answers; the label and UPC forms; the case
statuses; NULL, never a stand-in, for anything unknown (DATA-3); and
Restrict on every foreign key, so a movie with a case can't be deleted
(DATA-4). CaseMovies is keyed on the case and movie pair, so Phase 3's
rentals can point at a pair.

RewindDb drops its Properties<DateTime?>() line: EF Core applies the
DateTime convention to DateTime? too, and two round-trip tests now
guard it. SqliteConstraint gains Restrict, which SQLite reports as
SQLITE_CONSTRAINT_TRIGGER. DATA-9 and the Overview name Genres as a
TMDB table.

Co-Authored-By: Claude Opus 5.5 <noreply@anthropic.com>
</commit_message>
<xml_diff>
--- a/docs/Rewind - Coding Standards.docx
+++ b/docs/Rewind - Coding Standards.docx
@@ -13,7 +13,7 @@
     <w:p>
       <w:pPr/>
       <w:r>
-        <w:t xml:space="preserve">Oct 23, 2026</w:t>
+        <w:t xml:space="preserve">Oct 24, 2026</w:t>
       </w:r>
       <w:r>
         <w:t xml:space="preserve"> · </w:t>
@@ -1275,7 +1275,7 @@
         <w:t xml:space="preserve">DATA-9</w:t>
       </w:r>
       <w:r>
-        <w:t xml:space="preserve"> TMDB data lives only in Movies, MovieCast and MovieGenres, and a refresh writes only there. Family data lives in its own tables.</w:t>
+        <w:t xml:space="preserve"> TMDB data lives only in Movies, MovieCast, Genres and MovieGenres, and a refresh writes only there. Family data lives in its own tables.</w:t>
       </w:r>
     </w:p>
     <w:p>

</xml_diff>

<commit_message>
feat(data): model the catalog (#9)
Movies, MovieCast, Genres, MovieGenres, Cases, CaseMovies and
UpcLookups, added by one migration, AddCatalog (Build Plan 2.1). The
database holds the rules it can (DATA-11): unique labels, TMDB IDs,
billing places and UPC answers; the label and UPC forms; the case
statuses; NULL, never a stand-in, for anything unknown (DATA-3); and
Restrict on every foreign key, so a movie with a case can't be deleted
(DATA-4). CaseMovies is keyed on the case and movie pair, so Phase 3's
rentals can point at a pair.

RewindDb drops its Properties<DateTime?>() line: EF Core applies the
DateTime convention to DateTime? too, and two round-trip tests now
guard it. SqliteConstraint gains Restrict, which SQLite reports as
SQLITE_CONSTRAINT_TRIGGER. DATA-9 and the Overview name Genres as a
TMDB table.

Co-authored-by: Claude Opus 5.5 <noreply@anthropic.com>
</commit_message>
<xml_diff>
--- a/docs/Rewind - Coding Standards.docx
+++ b/docs/Rewind - Coding Standards.docx
@@ -13,7 +13,7 @@
     <w:p>
       <w:pPr/>
       <w:r>
-        <w:t xml:space="preserve">Oct 23, 2026</w:t>
+        <w:t xml:space="preserve">Oct 24, 2026</w:t>
       </w:r>
       <w:r>
         <w:t xml:space="preserve"> · </w:t>
@@ -1275,7 +1275,7 @@
         <w:t xml:space="preserve">DATA-9</w:t>
       </w:r>
       <w:r>
-        <w:t xml:space="preserve"> TMDB data lives only in Movies, MovieCast and MovieGenres, and a refresh writes only there. Family data lives in its own tables.</w:t>
+        <w:t xml:space="preserve"> TMDB data lives only in Movies, MovieCast, Genres and MovieGenres, and a refresh writes only there. Family data lives in its own tables.</w:t>
       </w:r>
     </w:p>
     <w:p>

</xml_diff>

<commit_message>
docs(standards): add NET-7's exception for committed writes
NET-7 has every async method that does I/O pass its CancellationToken
along. Once a write has committed, though, a cancel can only turn a
done outcome into an exception. ShelveAsync's case is on the shelf by
then, and cancelling its poster saves would report the case as failed
and its label as in use at the next scan (NET-12). #14 set NET-7 aside
there on purpose, and its review asked for the exception to be written
into the rule.

NET-7 now ends: "Once a write has committed, the steps that finish it
run with CancellationToken.None, so a cancel never turns a done
outcome into an exception (NET-12)." The Standards' date line moves to
Oct 25, 2026. MovieIntake's comment at that spot now cites NET-7's
exception instead of setting NET-7 aside.

Co-Authored-By: Claude Opus 5.5 <noreply@anthropic.com>
</commit_message>
<xml_diff>
--- a/docs/Rewind - Coding Standards.docx
+++ b/docs/Rewind - Coding Standards.docx
@@ -13,7 +13,7 @@
     <w:p>
       <w:pPr/>
       <w:r>
-        <w:t xml:space="preserve">Oct 24, 2026</w:t>
+        <w:t xml:space="preserve">Oct 25, 2026</w:t>
       </w:r>
       <w:r>
         <w:t xml:space="preserve"> · </w:t>
@@ -573,7 +573,7 @@
         <w:t xml:space="preserve">NET-7</w:t>
       </w:r>
       <w:r>
-        <w:t xml:space="preserve"> Every async method that does I/O takes a CancellationToken and passes it along.</w:t>
+        <w:t xml:space="preserve"> Every async method that does I/O takes a CancellationToken and passes it along. Once a write has committed, the steps that finish it run with CancellationToken.None, so a cancel never turns a done outcome into an exception (NET-12).</w:t>
       </w:r>
     </w:p>
     <w:p>

</xml_diff>

<commit_message>
docs(standards): add NET-7's exception for committed writes (#20)
NET-7 has every async method that does I/O pass its CancellationToken
along. Once a write has committed, though, a cancel can only turn a
done outcome into an exception. ShelveAsync's case is on the shelf by
then, and cancelling its poster saves would report the case as failed
and its label as in use at the next scan (NET-12). #14 set NET-7 aside
there on purpose, and its review asked for the exception to be written
into the rule.

NET-7 now ends: "Once a write has committed, the steps that finish it
run with CancellationToken.None, so a cancel never turns a done
outcome into an exception (NET-12)." The Standards' date line moves to
Oct 25, 2026. MovieIntake's comment at that spot now cites NET-7's
exception instead of setting NET-7 aside.

Co-Authored-By: Claude Opus 5.5 <noreply@anthropic.com>
</commit_message>
<xml_diff>
--- a/docs/Rewind - Coding Standards.docx
+++ b/docs/Rewind - Coding Standards.docx
@@ -13,7 +13,7 @@
     <w:p>
       <w:pPr/>
       <w:r>
-        <w:t xml:space="preserve">Oct 24, 2026</w:t>
+        <w:t xml:space="preserve">Oct 25, 2026</w:t>
       </w:r>
       <w:r>
         <w:t xml:space="preserve"> · </w:t>
@@ -573,7 +573,7 @@
         <w:t xml:space="preserve">NET-7</w:t>
       </w:r>
       <w:r>
-        <w:t xml:space="preserve"> Every async method that does I/O takes a CancellationToken and passes it along.</w:t>
+        <w:t xml:space="preserve"> Every async method that does I/O takes a CancellationToken and passes it along. Once a write has committed, the steps that finish it run with CancellationToken.None, so a cancel never turns a done outcome into an exception (NET-12).</w:t>
       </w:r>
     </w:p>
     <w:p>

</xml_diff>